<commit_message>
Fix system name from رُشن to روشن
</commit_message>
<xml_diff>
--- a/sample_data/سیاست-حریم-خصوصی.docx
+++ b/sample_data/سیاست-حریم-خصوصی.docx
@@ -12,12 +12,12 @@
     </w:p>
     <w:p>
       <w:r>
-        <w:t>سیاست حریم خصوصی سامانه رُشن. این سند نحوه جمع‌آوری، استفاده و حفاظت از اطلاعات کاربران را توضیح می‌دهد.</w:t>
+        <w:t>سیاست حریم خصوصی سامانه روشن. این سند نحوه جمع‌آوری، استفاده و حفاظت از اطلاعات کاربران را توضیح می‌دهد.</w:t>
       </w:r>
     </w:p>
     <w:p>
       <w:r>
-        <w:t>سامانه رُشن تنها اطلاعاتی را جمع‌آوری می‌کند که کاربر به صورت آگاهانه و اختیاری ارائه می‌دهد، مانند نام کاربری و محتوای اسناد بارگذاری‌شده.</w:t>
+        <w:t>سامانه روشن تنها اطلاعاتی را جمع‌آوری می‌کند که کاربر به صورت آگاهانه و اختیاری ارائه می‌دهد، مانند نام کاربری و محتوای اسناد بارگذاری‌شده.</w:t>
       </w:r>
     </w:p>
     <w:p>

</xml_diff>